<commit_message>
handouts and follow-along: Word and PDF copies rebuilt (sizing guide with the AVD demand and the node-loss reserve; follow-along with the three-pass sizing steps)
Co-Authored-By: Claude Opus 5.5 <noreply@anthropic.com>
</commit_message>
<xml_diff>
--- a/handouts/Azure_Local_Sizing_Guide.docx
+++ b/handouts/Azure_Local_Sizing_Guide.docx
@@ -889,6 +889,896 @@
           <w:lang w:val="en"/>
         </w:rPr>
         <w:t>Templates and the vCLS placeholder are excluded from this example.</w:t>
+      </w:r>
+    </w:p>
+    <w:p>
+      <w:pPr>
+        <w:pStyle w:val="NormalWeb"/>
+        <w:rPr>
+          <w:rFonts w:ascii="Segoe UI" w:hAnsi="Segoe UI" w:cs="Segoe UI"/>
+          <w:color w:val="1B2430"/>
+          <w:sz w:val="21"/>
+          <w:szCs w:val="21"/>
+          <w:lang w:val="en"/>
+        </w:rPr>
+      </w:pPr>
+      <w:r>
+        <w:rPr>
+          <w:rFonts w:ascii="Segoe UI" w:hAnsi="Segoe UI" w:cs="Segoe UI"/>
+          <w:color w:val="1B2430"/>
+          <w:sz w:val="21"/>
+          <w:szCs w:val="21"/>
+          <w:lang w:val="en"/>
+        </w:rPr>
+        <w:t>New workloads are not in an inventory of what runs today. In the session example the AVD workload comes from the AVD design and is added to the same demand:</w:t>
+      </w:r>
+    </w:p>
+    <w:tbl>
+      <w:tblPr>
+        <w:tblW w:w="5000" w:type="pct"/>
+        <w:tblCellMar>
+          <w:top w:w="15" w:type="dxa"/>
+          <w:left w:w="15" w:type="dxa"/>
+          <w:bottom w:w="15" w:type="dxa"/>
+          <w:right w:w="15" w:type="dxa"/>
+        </w:tblCellMar>
+        <w:tblLook w:val="04A0" w:firstRow="1" w:lastRow="0" w:firstColumn="1" w:lastColumn="0" w:noHBand="0" w:noVBand="1"/>
+      </w:tblPr>
+      <w:tblGrid>
+        <w:gridCol w:w="5658"/>
+        <w:gridCol w:w="572"/>
+        <w:gridCol w:w="651"/>
+        <w:gridCol w:w="914"/>
+        <w:gridCol w:w="1549"/>
+      </w:tblGrid>
+      <w:tr>
+        <w:trPr>
+          <w:cantSplit/>
+          <w:tblHeader/>
+        </w:trPr>
+        <w:tc>
+          <w:tcPr>
+            <w:tcW w:w="0" w:type="auto"/>
+            <w:tcBorders>
+              <w:top w:val="single" w:sz="6" w:space="0" w:color="B8C4D0"/>
+              <w:left w:val="single" w:sz="6" w:space="0" w:color="B8C4D0"/>
+              <w:bottom w:val="single" w:sz="6" w:space="0" w:color="B8C4D0"/>
+              <w:right w:val="single" w:sz="6" w:space="0" w:color="B8C4D0"/>
+            </w:tcBorders>
+            <w:shd w:val="clear" w:color="auto" w:fill="E6EDF3"/>
+            <w:tcMar>
+              <w:top w:w="60" w:type="dxa"/>
+              <w:left w:w="100" w:type="dxa"/>
+              <w:bottom w:w="60" w:type="dxa"/>
+              <w:right w:w="100" w:type="dxa"/>
+            </w:tcMar>
+            <w:hideMark/>
+          </w:tcPr>
+          <w:p>
+            <w:pPr>
+              <w:spacing w:before="120" w:after="200"/>
+              <w:rPr>
+                <w:rFonts w:ascii="Segoe UI" w:eastAsia="Times New Roman" w:hAnsi="Segoe UI" w:cs="Segoe UI"/>
+                <w:b/>
+                <w:bCs/>
+                <w:color w:val="1B2430"/>
+                <w:sz w:val="18"/>
+                <w:szCs w:val="18"/>
+              </w:rPr>
+            </w:pPr>
+            <w:r>
+              <w:rPr>
+                <w:rFonts w:ascii="Segoe UI" w:eastAsia="Times New Roman" w:hAnsi="Segoe UI" w:cs="Segoe UI"/>
+                <w:b/>
+                <w:bCs/>
+                <w:color w:val="1B2430"/>
+                <w:sz w:val="18"/>
+                <w:szCs w:val="18"/>
+              </w:rPr>
+              <w:t>Session example demand (synthetic estate + AVD as deployed)</w:t>
+            </w:r>
+          </w:p>
+        </w:tc>
+        <w:tc>
+          <w:tcPr>
+            <w:tcW w:w="0" w:type="auto"/>
+            <w:tcBorders>
+              <w:top w:val="single" w:sz="6" w:space="0" w:color="B8C4D0"/>
+              <w:left w:val="single" w:sz="6" w:space="0" w:color="B8C4D0"/>
+              <w:bottom w:val="single" w:sz="6" w:space="0" w:color="B8C4D0"/>
+              <w:right w:val="single" w:sz="6" w:space="0" w:color="B8C4D0"/>
+            </w:tcBorders>
+            <w:shd w:val="clear" w:color="auto" w:fill="E6EDF3"/>
+            <w:tcMar>
+              <w:top w:w="60" w:type="dxa"/>
+              <w:left w:w="100" w:type="dxa"/>
+              <w:bottom w:w="60" w:type="dxa"/>
+              <w:right w:w="100" w:type="dxa"/>
+            </w:tcMar>
+            <w:hideMark/>
+          </w:tcPr>
+          <w:p>
+            <w:pPr>
+              <w:spacing w:before="120" w:after="200"/>
+              <w:jc w:val="right"/>
+              <w:rPr>
+                <w:rFonts w:ascii="Segoe UI" w:eastAsia="Times New Roman" w:hAnsi="Segoe UI" w:cs="Segoe UI"/>
+                <w:b/>
+                <w:bCs/>
+                <w:color w:val="1B2430"/>
+                <w:sz w:val="18"/>
+                <w:szCs w:val="18"/>
+              </w:rPr>
+            </w:pPr>
+            <w:r>
+              <w:rPr>
+                <w:rFonts w:ascii="Segoe UI" w:eastAsia="Times New Roman" w:hAnsi="Segoe UI" w:cs="Segoe UI"/>
+                <w:b/>
+                <w:bCs/>
+                <w:color w:val="1B2430"/>
+                <w:sz w:val="18"/>
+                <w:szCs w:val="18"/>
+              </w:rPr>
+              <w:t>VMs</w:t>
+            </w:r>
+          </w:p>
+        </w:tc>
+        <w:tc>
+          <w:tcPr>
+            <w:tcW w:w="0" w:type="auto"/>
+            <w:tcBorders>
+              <w:top w:val="single" w:sz="6" w:space="0" w:color="B8C4D0"/>
+              <w:left w:val="single" w:sz="6" w:space="0" w:color="B8C4D0"/>
+              <w:bottom w:val="single" w:sz="6" w:space="0" w:color="B8C4D0"/>
+              <w:right w:val="single" w:sz="6" w:space="0" w:color="B8C4D0"/>
+            </w:tcBorders>
+            <w:shd w:val="clear" w:color="auto" w:fill="E6EDF3"/>
+            <w:tcMar>
+              <w:top w:w="60" w:type="dxa"/>
+              <w:left w:w="100" w:type="dxa"/>
+              <w:bottom w:w="60" w:type="dxa"/>
+              <w:right w:w="100" w:type="dxa"/>
+            </w:tcMar>
+            <w:hideMark/>
+          </w:tcPr>
+          <w:p>
+            <w:pPr>
+              <w:spacing w:before="120" w:after="200"/>
+              <w:jc w:val="right"/>
+              <w:rPr>
+                <w:rFonts w:ascii="Segoe UI" w:eastAsia="Times New Roman" w:hAnsi="Segoe UI" w:cs="Segoe UI"/>
+                <w:b/>
+                <w:bCs/>
+                <w:color w:val="1B2430"/>
+                <w:sz w:val="18"/>
+                <w:szCs w:val="18"/>
+              </w:rPr>
+            </w:pPr>
+            <w:r>
+              <w:rPr>
+                <w:rFonts w:ascii="Segoe UI" w:eastAsia="Times New Roman" w:hAnsi="Segoe UI" w:cs="Segoe UI"/>
+                <w:b/>
+                <w:bCs/>
+                <w:color w:val="1B2430"/>
+                <w:sz w:val="18"/>
+                <w:szCs w:val="18"/>
+              </w:rPr>
+              <w:t>vCPU</w:t>
+            </w:r>
+          </w:p>
+        </w:tc>
+        <w:tc>
+          <w:tcPr>
+            <w:tcW w:w="0" w:type="auto"/>
+            <w:tcBorders>
+              <w:top w:val="single" w:sz="6" w:space="0" w:color="B8C4D0"/>
+              <w:left w:val="single" w:sz="6" w:space="0" w:color="B8C4D0"/>
+              <w:bottom w:val="single" w:sz="6" w:space="0" w:color="B8C4D0"/>
+              <w:right w:val="single" w:sz="6" w:space="0" w:color="B8C4D0"/>
+            </w:tcBorders>
+            <w:shd w:val="clear" w:color="auto" w:fill="E6EDF3"/>
+            <w:tcMar>
+              <w:top w:w="60" w:type="dxa"/>
+              <w:left w:w="100" w:type="dxa"/>
+              <w:bottom w:w="60" w:type="dxa"/>
+              <w:right w:w="100" w:type="dxa"/>
+            </w:tcMar>
+            <w:hideMark/>
+          </w:tcPr>
+          <w:p>
+            <w:pPr>
+              <w:spacing w:before="120" w:after="200"/>
+              <w:jc w:val="right"/>
+              <w:rPr>
+                <w:rFonts w:ascii="Segoe UI" w:eastAsia="Times New Roman" w:hAnsi="Segoe UI" w:cs="Segoe UI"/>
+                <w:b/>
+                <w:bCs/>
+                <w:color w:val="1B2430"/>
+                <w:sz w:val="18"/>
+                <w:szCs w:val="18"/>
+              </w:rPr>
+            </w:pPr>
+            <w:r>
+              <w:rPr>
+                <w:rFonts w:ascii="Segoe UI" w:eastAsia="Times New Roman" w:hAnsi="Segoe UI" w:cs="Segoe UI"/>
+                <w:b/>
+                <w:bCs/>
+                <w:color w:val="1B2430"/>
+                <w:sz w:val="18"/>
+                <w:szCs w:val="18"/>
+              </w:rPr>
+              <w:t>Memory</w:t>
+            </w:r>
+          </w:p>
+        </w:tc>
+        <w:tc>
+          <w:tcPr>
+            <w:tcW w:w="0" w:type="auto"/>
+            <w:tcBorders>
+              <w:top w:val="single" w:sz="6" w:space="0" w:color="B8C4D0"/>
+              <w:left w:val="single" w:sz="6" w:space="0" w:color="B8C4D0"/>
+              <w:bottom w:val="single" w:sz="6" w:space="0" w:color="B8C4D0"/>
+              <w:right w:val="single" w:sz="6" w:space="0" w:color="B8C4D0"/>
+            </w:tcBorders>
+            <w:shd w:val="clear" w:color="auto" w:fill="E6EDF3"/>
+            <w:tcMar>
+              <w:top w:w="60" w:type="dxa"/>
+              <w:left w:w="100" w:type="dxa"/>
+              <w:bottom w:w="60" w:type="dxa"/>
+              <w:right w:w="100" w:type="dxa"/>
+            </w:tcMar>
+            <w:hideMark/>
+          </w:tcPr>
+          <w:p>
+            <w:pPr>
+              <w:spacing w:before="120" w:after="200"/>
+              <w:jc w:val="right"/>
+              <w:rPr>
+                <w:rFonts w:ascii="Segoe UI" w:eastAsia="Times New Roman" w:hAnsi="Segoe UI" w:cs="Segoe UI"/>
+                <w:b/>
+                <w:bCs/>
+                <w:color w:val="1B2430"/>
+                <w:sz w:val="18"/>
+                <w:szCs w:val="18"/>
+              </w:rPr>
+            </w:pPr>
+            <w:r>
+              <w:rPr>
+                <w:rFonts w:ascii="Segoe UI" w:eastAsia="Times New Roman" w:hAnsi="Segoe UI" w:cs="Segoe UI"/>
+                <w:b/>
+                <w:bCs/>
+                <w:color w:val="1B2430"/>
+                <w:sz w:val="18"/>
+                <w:szCs w:val="18"/>
+              </w:rPr>
+              <w:t>Provisioned storage</w:t>
+            </w:r>
+          </w:p>
+        </w:tc>
+      </w:tr>
+      <w:tr>
+        <w:trPr>
+          <w:cantSplit/>
+        </w:trPr>
+        <w:tc>
+          <w:tcPr>
+            <w:tcW w:w="0" w:type="auto"/>
+            <w:tcBorders>
+              <w:top w:val="single" w:sz="6" w:space="0" w:color="B8C4D0"/>
+              <w:left w:val="single" w:sz="6" w:space="0" w:color="B8C4D0"/>
+              <w:bottom w:val="single" w:sz="6" w:space="0" w:color="B8C4D0"/>
+              <w:right w:val="single" w:sz="6" w:space="0" w:color="B8C4D0"/>
+            </w:tcBorders>
+            <w:tcMar>
+              <w:top w:w="60" w:type="dxa"/>
+              <w:left w:w="100" w:type="dxa"/>
+              <w:bottom w:w="60" w:type="dxa"/>
+              <w:right w:w="100" w:type="dxa"/>
+            </w:tcMar>
+            <w:hideMark/>
+          </w:tcPr>
+          <w:p>
+            <w:pPr>
+              <w:spacing w:before="120" w:after="200"/>
+              <w:rPr>
+                <w:rFonts w:ascii="Segoe UI" w:eastAsia="Times New Roman" w:hAnsi="Segoe UI" w:cs="Segoe UI"/>
+                <w:color w:val="1B2430"/>
+                <w:sz w:val="18"/>
+                <w:szCs w:val="18"/>
+              </w:rPr>
+            </w:pPr>
+            <w:r>
+              <w:rPr>
+                <w:rFonts w:ascii="Segoe UI" w:eastAsia="Times New Roman" w:hAnsi="Segoe UI" w:cs="Segoe UI"/>
+                <w:color w:val="1B2430"/>
+                <w:sz w:val="18"/>
+                <w:szCs w:val="18"/>
+              </w:rPr>
+              <w:t>VMware estate (RVTools)</w:t>
+            </w:r>
+          </w:p>
+        </w:tc>
+        <w:tc>
+          <w:tcPr>
+            <w:tcW w:w="0" w:type="auto"/>
+            <w:tcBorders>
+              <w:top w:val="single" w:sz="6" w:space="0" w:color="B8C4D0"/>
+              <w:left w:val="single" w:sz="6" w:space="0" w:color="B8C4D0"/>
+              <w:bottom w:val="single" w:sz="6" w:space="0" w:color="B8C4D0"/>
+              <w:right w:val="single" w:sz="6" w:space="0" w:color="B8C4D0"/>
+            </w:tcBorders>
+            <w:tcMar>
+              <w:top w:w="60" w:type="dxa"/>
+              <w:left w:w="100" w:type="dxa"/>
+              <w:bottom w:w="60" w:type="dxa"/>
+              <w:right w:w="100" w:type="dxa"/>
+            </w:tcMar>
+            <w:hideMark/>
+          </w:tcPr>
+          <w:p>
+            <w:pPr>
+              <w:spacing w:before="120" w:after="200"/>
+              <w:jc w:val="right"/>
+              <w:rPr>
+                <w:rFonts w:ascii="Segoe UI" w:eastAsia="Times New Roman" w:hAnsi="Segoe UI" w:cs="Segoe UI"/>
+                <w:color w:val="1B2430"/>
+                <w:sz w:val="18"/>
+                <w:szCs w:val="18"/>
+              </w:rPr>
+            </w:pPr>
+            <w:r>
+              <w:rPr>
+                <w:rFonts w:ascii="Segoe UI" w:eastAsia="Times New Roman" w:hAnsi="Segoe UI" w:cs="Segoe UI"/>
+                <w:color w:val="1B2430"/>
+                <w:sz w:val="18"/>
+                <w:szCs w:val="18"/>
+              </w:rPr>
+              <w:t>24</w:t>
+            </w:r>
+          </w:p>
+        </w:tc>
+        <w:tc>
+          <w:tcPr>
+            <w:tcW w:w="0" w:type="auto"/>
+            <w:tcBorders>
+              <w:top w:val="single" w:sz="6" w:space="0" w:color="B8C4D0"/>
+              <w:left w:val="single" w:sz="6" w:space="0" w:color="B8C4D0"/>
+              <w:bottom w:val="single" w:sz="6" w:space="0" w:color="B8C4D0"/>
+              <w:right w:val="single" w:sz="6" w:space="0" w:color="B8C4D0"/>
+            </w:tcBorders>
+            <w:tcMar>
+              <w:top w:w="60" w:type="dxa"/>
+              <w:left w:w="100" w:type="dxa"/>
+              <w:bottom w:w="60" w:type="dxa"/>
+              <w:right w:w="100" w:type="dxa"/>
+            </w:tcMar>
+            <w:hideMark/>
+          </w:tcPr>
+          <w:p>
+            <w:pPr>
+              <w:spacing w:before="120" w:after="200"/>
+              <w:jc w:val="right"/>
+              <w:rPr>
+                <w:rFonts w:ascii="Segoe UI" w:eastAsia="Times New Roman" w:hAnsi="Segoe UI" w:cs="Segoe UI"/>
+                <w:color w:val="1B2430"/>
+                <w:sz w:val="18"/>
+                <w:szCs w:val="18"/>
+              </w:rPr>
+            </w:pPr>
+            <w:r>
+              <w:rPr>
+                <w:rFonts w:ascii="Segoe UI" w:eastAsia="Times New Roman" w:hAnsi="Segoe UI" w:cs="Segoe UI"/>
+                <w:color w:val="1B2430"/>
+                <w:sz w:val="18"/>
+                <w:szCs w:val="18"/>
+              </w:rPr>
+              <w:t>72</w:t>
+            </w:r>
+          </w:p>
+        </w:tc>
+        <w:tc>
+          <w:tcPr>
+            <w:tcW w:w="0" w:type="auto"/>
+            <w:tcBorders>
+              <w:top w:val="single" w:sz="6" w:space="0" w:color="B8C4D0"/>
+              <w:left w:val="single" w:sz="6" w:space="0" w:color="B8C4D0"/>
+              <w:bottom w:val="single" w:sz="6" w:space="0" w:color="B8C4D0"/>
+              <w:right w:val="single" w:sz="6" w:space="0" w:color="B8C4D0"/>
+            </w:tcBorders>
+            <w:tcMar>
+              <w:top w:w="60" w:type="dxa"/>
+              <w:left w:w="100" w:type="dxa"/>
+              <w:bottom w:w="60" w:type="dxa"/>
+              <w:right w:w="100" w:type="dxa"/>
+            </w:tcMar>
+            <w:hideMark/>
+          </w:tcPr>
+          <w:p>
+            <w:pPr>
+              <w:spacing w:before="120" w:after="200"/>
+              <w:jc w:val="right"/>
+              <w:rPr>
+                <w:rFonts w:ascii="Segoe UI" w:eastAsia="Times New Roman" w:hAnsi="Segoe UI" w:cs="Segoe UI"/>
+                <w:color w:val="1B2430"/>
+                <w:sz w:val="18"/>
+                <w:szCs w:val="18"/>
+              </w:rPr>
+            </w:pPr>
+            <w:r>
+              <w:rPr>
+                <w:rFonts w:ascii="Segoe UI" w:eastAsia="Times New Roman" w:hAnsi="Segoe UI" w:cs="Segoe UI"/>
+                <w:color w:val="1B2430"/>
+                <w:sz w:val="18"/>
+                <w:szCs w:val="18"/>
+              </w:rPr>
+              <w:t>160 GiB</w:t>
+            </w:r>
+          </w:p>
+        </w:tc>
+        <w:tc>
+          <w:tcPr>
+            <w:tcW w:w="0" w:type="auto"/>
+            <w:tcBorders>
+              <w:top w:val="single" w:sz="6" w:space="0" w:color="B8C4D0"/>
+              <w:left w:val="single" w:sz="6" w:space="0" w:color="B8C4D0"/>
+              <w:bottom w:val="single" w:sz="6" w:space="0" w:color="B8C4D0"/>
+              <w:right w:val="single" w:sz="6" w:space="0" w:color="B8C4D0"/>
+            </w:tcBorders>
+            <w:tcMar>
+              <w:top w:w="60" w:type="dxa"/>
+              <w:left w:w="100" w:type="dxa"/>
+              <w:bottom w:w="60" w:type="dxa"/>
+              <w:right w:w="100" w:type="dxa"/>
+            </w:tcMar>
+            <w:hideMark/>
+          </w:tcPr>
+          <w:p>
+            <w:pPr>
+              <w:spacing w:before="120" w:after="200"/>
+              <w:jc w:val="right"/>
+              <w:rPr>
+                <w:rFonts w:ascii="Segoe UI" w:eastAsia="Times New Roman" w:hAnsi="Segoe UI" w:cs="Segoe UI"/>
+                <w:color w:val="1B2430"/>
+                <w:sz w:val="18"/>
+                <w:szCs w:val="18"/>
+              </w:rPr>
+            </w:pPr>
+            <w:r>
+              <w:rPr>
+                <w:rFonts w:ascii="Segoe UI" w:eastAsia="Times New Roman" w:hAnsi="Segoe UI" w:cs="Segoe UI"/>
+                <w:color w:val="1B2430"/>
+                <w:sz w:val="18"/>
+                <w:szCs w:val="18"/>
+              </w:rPr>
+              <w:t>5.8 TiB</w:t>
+            </w:r>
+          </w:p>
+        </w:tc>
+      </w:tr>
+      <w:tr>
+        <w:trPr>
+          <w:cantSplit/>
+        </w:trPr>
+        <w:tc>
+          <w:tcPr>
+            <w:tcW w:w="0" w:type="auto"/>
+            <w:tcBorders>
+              <w:top w:val="single" w:sz="6" w:space="0" w:color="B8C4D0"/>
+              <w:left w:val="single" w:sz="6" w:space="0" w:color="B8C4D0"/>
+              <w:bottom w:val="single" w:sz="6" w:space="0" w:color="B8C4D0"/>
+              <w:right w:val="single" w:sz="6" w:space="0" w:color="B8C4D0"/>
+            </w:tcBorders>
+            <w:tcMar>
+              <w:top w:w="60" w:type="dxa"/>
+              <w:left w:w="100" w:type="dxa"/>
+              <w:bottom w:w="60" w:type="dxa"/>
+              <w:right w:w="100" w:type="dxa"/>
+            </w:tcMar>
+            <w:hideMark/>
+          </w:tcPr>
+          <w:p>
+            <w:pPr>
+              <w:spacing w:before="120" w:after="200"/>
+              <w:rPr>
+                <w:rFonts w:ascii="Segoe UI" w:eastAsia="Times New Roman" w:hAnsi="Segoe UI" w:cs="Segoe UI"/>
+                <w:color w:val="1B2430"/>
+                <w:sz w:val="18"/>
+                <w:szCs w:val="18"/>
+              </w:rPr>
+            </w:pPr>
+            <w:r>
+              <w:rPr>
+                <w:rFonts w:ascii="Segoe UI" w:eastAsia="Times New Roman" w:hAnsi="Segoe UI" w:cs="Segoe UI"/>
+                <w:color w:val="1B2430"/>
+                <w:sz w:val="18"/>
+                <w:szCs w:val="18"/>
+              </w:rPr>
+              <w:t>AVD: three session hosts (one with a GPU by DDA), two AVD Hybrid hosts, two scale-out file server nodes for FSLogix profiles</w:t>
+            </w:r>
+          </w:p>
+        </w:tc>
+        <w:tc>
+          <w:tcPr>
+            <w:tcW w:w="0" w:type="auto"/>
+            <w:tcBorders>
+              <w:top w:val="single" w:sz="6" w:space="0" w:color="B8C4D0"/>
+              <w:left w:val="single" w:sz="6" w:space="0" w:color="B8C4D0"/>
+              <w:bottom w:val="single" w:sz="6" w:space="0" w:color="B8C4D0"/>
+              <w:right w:val="single" w:sz="6" w:space="0" w:color="B8C4D0"/>
+            </w:tcBorders>
+            <w:tcMar>
+              <w:top w:w="60" w:type="dxa"/>
+              <w:left w:w="100" w:type="dxa"/>
+              <w:bottom w:w="60" w:type="dxa"/>
+              <w:right w:w="100" w:type="dxa"/>
+            </w:tcMar>
+            <w:hideMark/>
+          </w:tcPr>
+          <w:p>
+            <w:pPr>
+              <w:spacing w:before="120" w:after="200"/>
+              <w:jc w:val="right"/>
+              <w:rPr>
+                <w:rFonts w:ascii="Segoe UI" w:eastAsia="Times New Roman" w:hAnsi="Segoe UI" w:cs="Segoe UI"/>
+                <w:color w:val="1B2430"/>
+                <w:sz w:val="18"/>
+                <w:szCs w:val="18"/>
+              </w:rPr>
+            </w:pPr>
+            <w:r>
+              <w:rPr>
+                <w:rFonts w:ascii="Segoe UI" w:eastAsia="Times New Roman" w:hAnsi="Segoe UI" w:cs="Segoe UI"/>
+                <w:color w:val="1B2430"/>
+                <w:sz w:val="18"/>
+                <w:szCs w:val="18"/>
+              </w:rPr>
+              <w:t>7</w:t>
+            </w:r>
+          </w:p>
+        </w:tc>
+        <w:tc>
+          <w:tcPr>
+            <w:tcW w:w="0" w:type="auto"/>
+            <w:tcBorders>
+              <w:top w:val="single" w:sz="6" w:space="0" w:color="B8C4D0"/>
+              <w:left w:val="single" w:sz="6" w:space="0" w:color="B8C4D0"/>
+              <w:bottom w:val="single" w:sz="6" w:space="0" w:color="B8C4D0"/>
+              <w:right w:val="single" w:sz="6" w:space="0" w:color="B8C4D0"/>
+            </w:tcBorders>
+            <w:tcMar>
+              <w:top w:w="60" w:type="dxa"/>
+              <w:left w:w="100" w:type="dxa"/>
+              <w:bottom w:w="60" w:type="dxa"/>
+              <w:right w:w="100" w:type="dxa"/>
+            </w:tcMar>
+            <w:hideMark/>
+          </w:tcPr>
+          <w:p>
+            <w:pPr>
+              <w:spacing w:before="120" w:after="200"/>
+              <w:jc w:val="right"/>
+              <w:rPr>
+                <w:rFonts w:ascii="Segoe UI" w:eastAsia="Times New Roman" w:hAnsi="Segoe UI" w:cs="Segoe UI"/>
+                <w:color w:val="1B2430"/>
+                <w:sz w:val="18"/>
+                <w:szCs w:val="18"/>
+              </w:rPr>
+            </w:pPr>
+            <w:r>
+              <w:rPr>
+                <w:rFonts w:ascii="Segoe UI" w:eastAsia="Times New Roman" w:hAnsi="Segoe UI" w:cs="Segoe UI"/>
+                <w:color w:val="1B2430"/>
+                <w:sz w:val="18"/>
+                <w:szCs w:val="18"/>
+              </w:rPr>
+              <w:t>32</w:t>
+            </w:r>
+          </w:p>
+        </w:tc>
+        <w:tc>
+          <w:tcPr>
+            <w:tcW w:w="0" w:type="auto"/>
+            <w:tcBorders>
+              <w:top w:val="single" w:sz="6" w:space="0" w:color="B8C4D0"/>
+              <w:left w:val="single" w:sz="6" w:space="0" w:color="B8C4D0"/>
+              <w:bottom w:val="single" w:sz="6" w:space="0" w:color="B8C4D0"/>
+              <w:right w:val="single" w:sz="6" w:space="0" w:color="B8C4D0"/>
+            </w:tcBorders>
+            <w:tcMar>
+              <w:top w:w="60" w:type="dxa"/>
+              <w:left w:w="100" w:type="dxa"/>
+              <w:bottom w:w="60" w:type="dxa"/>
+              <w:right w:w="100" w:type="dxa"/>
+            </w:tcMar>
+            <w:hideMark/>
+          </w:tcPr>
+          <w:p>
+            <w:pPr>
+              <w:spacing w:before="120" w:after="200"/>
+              <w:jc w:val="right"/>
+              <w:rPr>
+                <w:rFonts w:ascii="Segoe UI" w:eastAsia="Times New Roman" w:hAnsi="Segoe UI" w:cs="Segoe UI"/>
+                <w:color w:val="1B2430"/>
+                <w:sz w:val="18"/>
+                <w:szCs w:val="18"/>
+              </w:rPr>
+            </w:pPr>
+            <w:r>
+              <w:rPr>
+                <w:rFonts w:ascii="Segoe UI" w:eastAsia="Times New Roman" w:hAnsi="Segoe UI" w:cs="Segoe UI"/>
+                <w:color w:val="1B2430"/>
+                <w:sz w:val="18"/>
+                <w:szCs w:val="18"/>
+              </w:rPr>
+              <w:t>112 GiB</w:t>
+            </w:r>
+          </w:p>
+        </w:tc>
+        <w:tc>
+          <w:tcPr>
+            <w:tcW w:w="0" w:type="auto"/>
+            <w:tcBorders>
+              <w:top w:val="single" w:sz="6" w:space="0" w:color="B8C4D0"/>
+              <w:left w:val="single" w:sz="6" w:space="0" w:color="B8C4D0"/>
+              <w:bottom w:val="single" w:sz="6" w:space="0" w:color="B8C4D0"/>
+              <w:right w:val="single" w:sz="6" w:space="0" w:color="B8C4D0"/>
+            </w:tcBorders>
+            <w:tcMar>
+              <w:top w:w="60" w:type="dxa"/>
+              <w:left w:w="100" w:type="dxa"/>
+              <w:bottom w:w="60" w:type="dxa"/>
+              <w:right w:w="100" w:type="dxa"/>
+            </w:tcMar>
+            <w:hideMark/>
+          </w:tcPr>
+          <w:p>
+            <w:pPr>
+              <w:spacing w:before="120" w:after="200"/>
+              <w:jc w:val="right"/>
+              <w:rPr>
+                <w:rFonts w:ascii="Segoe UI" w:eastAsia="Times New Roman" w:hAnsi="Segoe UI" w:cs="Segoe UI"/>
+                <w:color w:val="1B2430"/>
+                <w:sz w:val="18"/>
+                <w:szCs w:val="18"/>
+              </w:rPr>
+            </w:pPr>
+            <w:r>
+              <w:rPr>
+                <w:rFonts w:ascii="Segoe UI" w:eastAsia="Times New Roman" w:hAnsi="Segoe UI" w:cs="Segoe UI"/>
+                <w:color w:val="1B2430"/>
+                <w:sz w:val="18"/>
+                <w:szCs w:val="18"/>
+              </w:rPr>
+              <w:t>2.9 TiB</w:t>
+            </w:r>
+          </w:p>
+        </w:tc>
+      </w:tr>
+      <w:tr>
+        <w:trPr>
+          <w:cantSplit/>
+        </w:trPr>
+        <w:tc>
+          <w:tcPr>
+            <w:tcW w:w="0" w:type="auto"/>
+            <w:tcBorders>
+              <w:top w:val="single" w:sz="6" w:space="0" w:color="B8C4D0"/>
+              <w:left w:val="single" w:sz="6" w:space="0" w:color="B8C4D0"/>
+              <w:bottom w:val="single" w:sz="6" w:space="0" w:color="B8C4D0"/>
+              <w:right w:val="single" w:sz="6" w:space="0" w:color="B8C4D0"/>
+            </w:tcBorders>
+            <w:tcMar>
+              <w:top w:w="60" w:type="dxa"/>
+              <w:left w:w="100" w:type="dxa"/>
+              <w:bottom w:w="60" w:type="dxa"/>
+              <w:right w:w="100" w:type="dxa"/>
+            </w:tcMar>
+            <w:hideMark/>
+          </w:tcPr>
+          <w:p>
+            <w:pPr>
+              <w:spacing w:before="120" w:after="200"/>
+              <w:rPr>
+                <w:rFonts w:ascii="Segoe UI" w:eastAsia="Times New Roman" w:hAnsi="Segoe UI" w:cs="Segoe UI"/>
+                <w:color w:val="1B2430"/>
+                <w:sz w:val="18"/>
+                <w:szCs w:val="18"/>
+              </w:rPr>
+            </w:pPr>
+            <w:r>
+              <w:rPr>
+                <w:rStyle w:val="Strong"/>
+                <w:rFonts w:ascii="Segoe UI" w:eastAsia="Times New Roman" w:hAnsi="Segoe UI" w:cs="Segoe UI"/>
+                <w:color w:val="1B2430"/>
+                <w:sz w:val="18"/>
+                <w:szCs w:val="18"/>
+              </w:rPr>
+              <w:t>Total</w:t>
+            </w:r>
+          </w:p>
+        </w:tc>
+        <w:tc>
+          <w:tcPr>
+            <w:tcW w:w="0" w:type="auto"/>
+            <w:tcBorders>
+              <w:top w:val="single" w:sz="6" w:space="0" w:color="B8C4D0"/>
+              <w:left w:val="single" w:sz="6" w:space="0" w:color="B8C4D0"/>
+              <w:bottom w:val="single" w:sz="6" w:space="0" w:color="B8C4D0"/>
+              <w:right w:val="single" w:sz="6" w:space="0" w:color="B8C4D0"/>
+            </w:tcBorders>
+            <w:tcMar>
+              <w:top w:w="60" w:type="dxa"/>
+              <w:left w:w="100" w:type="dxa"/>
+              <w:bottom w:w="60" w:type="dxa"/>
+              <w:right w:w="100" w:type="dxa"/>
+            </w:tcMar>
+            <w:hideMark/>
+          </w:tcPr>
+          <w:p>
+            <w:pPr>
+              <w:spacing w:before="120" w:after="200"/>
+              <w:jc w:val="right"/>
+              <w:rPr>
+                <w:rFonts w:ascii="Segoe UI" w:eastAsia="Times New Roman" w:hAnsi="Segoe UI" w:cs="Segoe UI"/>
+                <w:color w:val="1B2430"/>
+                <w:sz w:val="18"/>
+                <w:szCs w:val="18"/>
+              </w:rPr>
+            </w:pPr>
+            <w:r>
+              <w:rPr>
+                <w:rStyle w:val="Strong"/>
+                <w:rFonts w:ascii="Segoe UI" w:eastAsia="Times New Roman" w:hAnsi="Segoe UI" w:cs="Segoe UI"/>
+                <w:color w:val="1B2430"/>
+                <w:sz w:val="18"/>
+                <w:szCs w:val="18"/>
+              </w:rPr>
+              <w:t>31</w:t>
+            </w:r>
+          </w:p>
+        </w:tc>
+        <w:tc>
+          <w:tcPr>
+            <w:tcW w:w="0" w:type="auto"/>
+            <w:tcBorders>
+              <w:top w:val="single" w:sz="6" w:space="0" w:color="B8C4D0"/>
+              <w:left w:val="single" w:sz="6" w:space="0" w:color="B8C4D0"/>
+              <w:bottom w:val="single" w:sz="6" w:space="0" w:color="B8C4D0"/>
+              <w:right w:val="single" w:sz="6" w:space="0" w:color="B8C4D0"/>
+            </w:tcBorders>
+            <w:tcMar>
+              <w:top w:w="60" w:type="dxa"/>
+              <w:left w:w="100" w:type="dxa"/>
+              <w:bottom w:w="60" w:type="dxa"/>
+              <w:right w:w="100" w:type="dxa"/>
+            </w:tcMar>
+            <w:hideMark/>
+          </w:tcPr>
+          <w:p>
+            <w:pPr>
+              <w:spacing w:before="120" w:after="200"/>
+              <w:jc w:val="right"/>
+              <w:rPr>
+                <w:rFonts w:ascii="Segoe UI" w:eastAsia="Times New Roman" w:hAnsi="Segoe UI" w:cs="Segoe UI"/>
+                <w:color w:val="1B2430"/>
+                <w:sz w:val="18"/>
+                <w:szCs w:val="18"/>
+              </w:rPr>
+            </w:pPr>
+            <w:r>
+              <w:rPr>
+                <w:rStyle w:val="Strong"/>
+                <w:rFonts w:ascii="Segoe UI" w:eastAsia="Times New Roman" w:hAnsi="Segoe UI" w:cs="Segoe UI"/>
+                <w:color w:val="1B2430"/>
+                <w:sz w:val="18"/>
+                <w:szCs w:val="18"/>
+              </w:rPr>
+              <w:t>104</w:t>
+            </w:r>
+          </w:p>
+        </w:tc>
+        <w:tc>
+          <w:tcPr>
+            <w:tcW w:w="0" w:type="auto"/>
+            <w:tcBorders>
+              <w:top w:val="single" w:sz="6" w:space="0" w:color="B8C4D0"/>
+              <w:left w:val="single" w:sz="6" w:space="0" w:color="B8C4D0"/>
+              <w:bottom w:val="single" w:sz="6" w:space="0" w:color="B8C4D0"/>
+              <w:right w:val="single" w:sz="6" w:space="0" w:color="B8C4D0"/>
+            </w:tcBorders>
+            <w:tcMar>
+              <w:top w:w="60" w:type="dxa"/>
+              <w:left w:w="100" w:type="dxa"/>
+              <w:bottom w:w="60" w:type="dxa"/>
+              <w:right w:w="100" w:type="dxa"/>
+            </w:tcMar>
+            <w:hideMark/>
+          </w:tcPr>
+          <w:p>
+            <w:pPr>
+              <w:spacing w:before="120" w:after="200"/>
+              <w:jc w:val="right"/>
+              <w:rPr>
+                <w:rFonts w:ascii="Segoe UI" w:eastAsia="Times New Roman" w:hAnsi="Segoe UI" w:cs="Segoe UI"/>
+                <w:color w:val="1B2430"/>
+                <w:sz w:val="18"/>
+                <w:szCs w:val="18"/>
+              </w:rPr>
+            </w:pPr>
+            <w:r>
+              <w:rPr>
+                <w:rStyle w:val="Strong"/>
+                <w:rFonts w:ascii="Segoe UI" w:eastAsia="Times New Roman" w:hAnsi="Segoe UI" w:cs="Segoe UI"/>
+                <w:color w:val="1B2430"/>
+                <w:sz w:val="18"/>
+                <w:szCs w:val="18"/>
+              </w:rPr>
+              <w:t>272 GiB</w:t>
+            </w:r>
+          </w:p>
+        </w:tc>
+        <w:tc>
+          <w:tcPr>
+            <w:tcW w:w="0" w:type="auto"/>
+            <w:tcBorders>
+              <w:top w:val="single" w:sz="6" w:space="0" w:color="B8C4D0"/>
+              <w:left w:val="single" w:sz="6" w:space="0" w:color="B8C4D0"/>
+              <w:bottom w:val="single" w:sz="6" w:space="0" w:color="B8C4D0"/>
+              <w:right w:val="single" w:sz="6" w:space="0" w:color="B8C4D0"/>
+            </w:tcBorders>
+            <w:tcMar>
+              <w:top w:w="60" w:type="dxa"/>
+              <w:left w:w="100" w:type="dxa"/>
+              <w:bottom w:w="60" w:type="dxa"/>
+              <w:right w:w="100" w:type="dxa"/>
+            </w:tcMar>
+            <w:hideMark/>
+          </w:tcPr>
+          <w:p>
+            <w:pPr>
+              <w:spacing w:before="120" w:after="200"/>
+              <w:jc w:val="right"/>
+              <w:rPr>
+                <w:rFonts w:ascii="Segoe UI" w:eastAsia="Times New Roman" w:hAnsi="Segoe UI" w:cs="Segoe UI"/>
+                <w:color w:val="1B2430"/>
+                <w:sz w:val="18"/>
+                <w:szCs w:val="18"/>
+              </w:rPr>
+            </w:pPr>
+            <w:r>
+              <w:rPr>
+                <w:rStyle w:val="Strong"/>
+                <w:rFonts w:ascii="Segoe UI" w:eastAsia="Times New Roman" w:hAnsi="Segoe UI" w:cs="Segoe UI"/>
+                <w:color w:val="1B2430"/>
+                <w:sz w:val="18"/>
+                <w:szCs w:val="18"/>
+              </w:rPr>
+              <w:t>8.6 TiB</w:t>
+            </w:r>
+          </w:p>
+        </w:tc>
+      </w:tr>
+    </w:tbl>
+    <w:p>
+      <w:pPr>
+        <w:pStyle w:val="NormalWeb"/>
+        <w:rPr>
+          <w:rFonts w:ascii="Segoe UI" w:hAnsi="Segoe UI" w:cs="Segoe UI"/>
+          <w:color w:val="1B2430"/>
+          <w:sz w:val="21"/>
+          <w:szCs w:val="21"/>
+          <w:lang w:val="en"/>
+        </w:rPr>
+      </w:pPr>
+      <w:r>
+        <w:rPr>
+          <w:rFonts w:ascii="Segoe UI" w:hAnsi="Segoe UI" w:cs="Segoe UI"/>
+          <w:color w:val="1B2430"/>
+          <w:sz w:val="21"/>
+          <w:szCs w:val="21"/>
+          <w:lang w:val="en"/>
+        </w:rPr>
+        <w:t>Across both machines (512 GiB) this fits on paper, and that is the trap. At full allocation 272 GiB does not fit one 256 GiB machine, so with one machine drained for an update or lost to a failure the VMs cannot fail over, and every update becomes an outage window. On two machines, everything must fit on one machine with its reserve. Adjust the plan instead: right-size from measured memory (P95, not allocation), move part of the estate to a later migration wave, or add memory per machine or a third machine.</w:t>
       </w:r>
     </w:p>
     <w:p>
@@ -1849,7 +2739,6 @@
                 <w:sz w:val="18"/>
                 <w:szCs w:val="18"/>
               </w:rPr>
-              <w:lastRenderedPageBreak/>
               <w:t>Three</w:t>
             </w:r>
           </w:p>
@@ -2464,7 +3353,17 @@
           <w:szCs w:val="21"/>
           <w:lang w:val="en"/>
         </w:rPr>
-        <w:t>Microsoft recommends nested resiliency for production two-server clusters. With three servers, two unavailable servers lose pool quorum. Rack-aware clusters require rack-level nested mirroring and support only two-way or four-way mirror volumes. In a two-machine cloud deployment, the Express storage configuration creates two-way mirrored thin volumes. Which resiliency you can choose is independent of drive type.</w:t>
+        <w:t xml:space="preserve">Microsoft recommends nested resiliency for production two-server clusters. With three servers, two unavailable servers lose pool quorum. Rack-aware clusters require rack-level nested mirroring and support only two-way or four-way </w:t>
+      </w:r>
+      <w:r>
+        <w:rPr>
+          <w:rFonts w:ascii="Segoe UI" w:hAnsi="Segoe UI" w:cs="Segoe UI"/>
+          <w:color w:val="1B2430"/>
+          <w:sz w:val="21"/>
+          <w:szCs w:val="21"/>
+          <w:lang w:val="en"/>
+        </w:rPr>
+        <w:t>mirror volumes. In a two-machine cloud deployment, the Express storage configuration creates two-way mirrored thin volumes. Which resiliency you can choose is independent of drive type.</w:t>
       </w:r>
     </w:p>
     <w:p>
@@ -5124,9 +6023,122 @@
 <file path=word/numbering.xml><?xml version="1.0" encoding="utf-8"?>
 <w:numbering xmlns:wpc="http://schemas.microsoft.com/office/word/2010/wordprocessingCanvas" xmlns:cx="http://schemas.microsoft.com/office/drawing/2014/chartex" xmlns:cx1="http://schemas.microsoft.com/office/drawing/2015/9/8/chartex" xmlns:cx2="http://schemas.microsoft.com/office/drawing/2015/10/21/chartex" xmlns:cx3="http://schemas.microsoft.com/office/drawing/2016/5/9/chartex" xmlns:cx4="http://schemas.microsoft.com/office/drawing/2016/5/10/chartex" xmlns:cx5="http://schemas.microsoft.com/office/drawing/2016/5/11/chartex" xmlns:cx6="http://schemas.microsoft.com/office/drawing/2016/5/12/chartex" xmlns:cx7="http://schemas.microsoft.com/office/drawing/2016/5/13/chartex" xmlns:cx8="http://schemas.microsoft.com/office/drawing/2016/5/14/chartex" xmlns:mc="http://schemas.openxmlformats.org/markup-compatibility/2006" xmlns:aink="http://schemas.microsoft.com/office/drawing/2016/ink" xmlns:am3d="http://schemas.microsoft.com/office/drawing/2017/model3d" xmlns:o="urn:schemas-microsoft-com:office:office" xmlns:oel="http://schemas.microsoft.com/office/2019/extlst" xmlns:r="http://schemas.openxmlformats.org/officeDocument/2006/relationships" xmlns:m="http://schemas.openxmlformats.org/officeDocument/2006/math" xmlns:v="urn:schemas-microsoft-com:vml" xmlns:wp14="http://schemas.microsoft.com/office/word/2010/wordprocessingDrawing" xmlns:wp="http://schemas.openxmlformats.org/drawingml/2006/wordprocessingDrawing" xmlns:w10="urn:schemas-microsoft-com:office:word" xmlns:w="http://schemas.openxmlformats.org/wordprocessingml/2006/main" xmlns:w14="http://schemas.microsoft.com/office/word/2010/wordml" xmlns:w15="http://schemas.microsoft.com/office/word/2012/wordml" xmlns:w16cex="http://schemas.microsoft.com/office/word/2018/wordml/cex" xmlns:w16cid="http://schemas.microsoft.com/office/word/2016/wordml/cid" xmlns:w16="http://schemas.microsoft.com/office/word/2018/wordml" xmlns:w16du="http://schemas.microsoft.com/office/word/2023/wordml/word16du" xmlns:w16sdtdh="http://schemas.microsoft.com/office/word/2020/wordml/sdtdatahash" xmlns:w16sdtfl="http://schemas.microsoft.com/office/word/2024/wordml/sdtformatlock" xmlns:w16se="http://schemas.microsoft.com/office/word/2015/wordml/symex" xmlns:wpg="http://schemas.microsoft.com/office/word/2010/wordprocessingGroup" xmlns:wpi="http://schemas.microsoft.com/office/word/2010/wordprocessingInk" xmlns:wne="http://schemas.microsoft.com/office/word/2006/wordml" xmlns:wps="http://schemas.microsoft.com/office/word/2010/wordprocessingShape" mc:Ignorable="w14 w15 w16se w16cid w16 w16cex w16sdtdh w16sdtfl w16du wp14">
   <w:abstractNum w:abstractNumId="0" w15:restartNumberingAfterBreak="0">
-    <w:nsid w:val="0B8C3E69"/>
+    <w:nsid w:val="09831E57"/>
     <w:multiLevelType w:val="multilevel"/>
-    <w:tmpl w:val="EDDEDEF8"/>
+    <w:tmpl w:val="C2C6CB30"/>
+    <w:lvl w:ilvl="0">
+      <w:start w:val="1"/>
+      <w:numFmt w:val="decimal"/>
+      <w:lvlText w:val="%1."/>
+      <w:lvlJc w:val="left"/>
+      <w:pPr>
+        <w:tabs>
+          <w:tab w:val="num" w:pos="720"/>
+        </w:tabs>
+        <w:ind w:left="720" w:hanging="360"/>
+      </w:pPr>
+    </w:lvl>
+    <w:lvl w:ilvl="1" w:tentative="1">
+      <w:start w:val="1"/>
+      <w:numFmt w:val="decimal"/>
+      <w:lvlText w:val="%2."/>
+      <w:lvlJc w:val="left"/>
+      <w:pPr>
+        <w:tabs>
+          <w:tab w:val="num" w:pos="1440"/>
+        </w:tabs>
+        <w:ind w:left="1440" w:hanging="360"/>
+      </w:pPr>
+    </w:lvl>
+    <w:lvl w:ilvl="2" w:tentative="1">
+      <w:start w:val="1"/>
+      <w:numFmt w:val="decimal"/>
+      <w:lvlText w:val="%3."/>
+      <w:lvlJc w:val="left"/>
+      <w:pPr>
+        <w:tabs>
+          <w:tab w:val="num" w:pos="2160"/>
+        </w:tabs>
+        <w:ind w:left="2160" w:hanging="360"/>
+      </w:pPr>
+    </w:lvl>
+    <w:lvl w:ilvl="3" w:tentative="1">
+      <w:start w:val="1"/>
+      <w:numFmt w:val="decimal"/>
+      <w:lvlText w:val="%4."/>
+      <w:lvlJc w:val="left"/>
+      <w:pPr>
+        <w:tabs>
+          <w:tab w:val="num" w:pos="2880"/>
+        </w:tabs>
+        <w:ind w:left="2880" w:hanging="360"/>
+      </w:pPr>
+    </w:lvl>
+    <w:lvl w:ilvl="4" w:tentative="1">
+      <w:start w:val="1"/>
+      <w:numFmt w:val="decimal"/>
+      <w:lvlText w:val="%5."/>
+      <w:lvlJc w:val="left"/>
+      <w:pPr>
+        <w:tabs>
+          <w:tab w:val="num" w:pos="3600"/>
+        </w:tabs>
+        <w:ind w:left="3600" w:hanging="360"/>
+      </w:pPr>
+    </w:lvl>
+    <w:lvl w:ilvl="5" w:tentative="1">
+      <w:start w:val="1"/>
+      <w:numFmt w:val="decimal"/>
+      <w:lvlText w:val="%6."/>
+      <w:lvlJc w:val="left"/>
+      <w:pPr>
+        <w:tabs>
+          <w:tab w:val="num" w:pos="4320"/>
+        </w:tabs>
+        <w:ind w:left="4320" w:hanging="360"/>
+      </w:pPr>
+    </w:lvl>
+    <w:lvl w:ilvl="6" w:tentative="1">
+      <w:start w:val="1"/>
+      <w:numFmt w:val="decimal"/>
+      <w:lvlText w:val="%7."/>
+      <w:lvlJc w:val="left"/>
+      <w:pPr>
+        <w:tabs>
+          <w:tab w:val="num" w:pos="5040"/>
+        </w:tabs>
+        <w:ind w:left="5040" w:hanging="360"/>
+      </w:pPr>
+    </w:lvl>
+    <w:lvl w:ilvl="7" w:tentative="1">
+      <w:start w:val="1"/>
+      <w:numFmt w:val="decimal"/>
+      <w:lvlText w:val="%8."/>
+      <w:lvlJc w:val="left"/>
+      <w:pPr>
+        <w:tabs>
+          <w:tab w:val="num" w:pos="5760"/>
+        </w:tabs>
+        <w:ind w:left="5760" w:hanging="360"/>
+      </w:pPr>
+    </w:lvl>
+    <w:lvl w:ilvl="8" w:tentative="1">
+      <w:start w:val="1"/>
+      <w:numFmt w:val="decimal"/>
+      <w:lvlText w:val="%9."/>
+      <w:lvlJc w:val="left"/>
+      <w:pPr>
+        <w:tabs>
+          <w:tab w:val="num" w:pos="6480"/>
+        </w:tabs>
+        <w:ind w:left="6480" w:hanging="360"/>
+      </w:pPr>
+    </w:lvl>
+  </w:abstractNum>
+  <w:abstractNum w:abstractNumId="1" w15:restartNumberingAfterBreak="0">
+    <w:nsid w:val="0F586658"/>
+    <w:multiLevelType w:val="multilevel"/>
+    <w:tmpl w:val="20967618"/>
     <w:lvl w:ilvl="0">
       <w:start w:val="1"/>
       <w:numFmt w:val="bullet"/>
@@ -5272,10 +6284,10 @@
       </w:rPr>
     </w:lvl>
   </w:abstractNum>
-  <w:abstractNum w:abstractNumId="1" w15:restartNumberingAfterBreak="0">
-    <w:nsid w:val="284A4F8C"/>
+  <w:abstractNum w:abstractNumId="2" w15:restartNumberingAfterBreak="0">
+    <w:nsid w:val="197437B0"/>
     <w:multiLevelType w:val="multilevel"/>
-    <w:tmpl w:val="D0665DA2"/>
+    <w:tmpl w:val="37341632"/>
     <w:lvl w:ilvl="0">
       <w:start w:val="1"/>
       <w:numFmt w:val="bullet"/>
@@ -5421,10 +6433,10 @@
       </w:rPr>
     </w:lvl>
   </w:abstractNum>
-  <w:abstractNum w:abstractNumId="2" w15:restartNumberingAfterBreak="0">
-    <w:nsid w:val="297F2829"/>
+  <w:abstractNum w:abstractNumId="3" w15:restartNumberingAfterBreak="0">
+    <w:nsid w:val="2B836F0C"/>
     <w:multiLevelType w:val="multilevel"/>
-    <w:tmpl w:val="F1D6228A"/>
+    <w:tmpl w:val="DE6EADC6"/>
     <w:lvl w:ilvl="0">
       <w:start w:val="1"/>
       <w:numFmt w:val="bullet"/>
@@ -5570,10 +6582,10 @@
       </w:rPr>
     </w:lvl>
   </w:abstractNum>
-  <w:abstractNum w:abstractNumId="3" w15:restartNumberingAfterBreak="0">
-    <w:nsid w:val="2F6F6689"/>
+  <w:abstractNum w:abstractNumId="4" w15:restartNumberingAfterBreak="0">
+    <w:nsid w:val="2CE9346E"/>
     <w:multiLevelType w:val="multilevel"/>
-    <w:tmpl w:val="D30A9F20"/>
+    <w:tmpl w:val="5584FADC"/>
     <w:lvl w:ilvl="0">
       <w:start w:val="1"/>
       <w:numFmt w:val="bullet"/>
@@ -5719,10 +6731,10 @@
       </w:rPr>
     </w:lvl>
   </w:abstractNum>
-  <w:abstractNum w:abstractNumId="4" w15:restartNumberingAfterBreak="0">
-    <w:nsid w:val="4BCF17B9"/>
+  <w:abstractNum w:abstractNumId="5" w15:restartNumberingAfterBreak="0">
+    <w:nsid w:val="41B50B3C"/>
     <w:multiLevelType w:val="multilevel"/>
-    <w:tmpl w:val="8188A35E"/>
+    <w:tmpl w:val="39446428"/>
     <w:lvl w:ilvl="0">
       <w:start w:val="1"/>
       <w:numFmt w:val="bullet"/>
@@ -5868,10 +6880,10 @@
       </w:rPr>
     </w:lvl>
   </w:abstractNum>
-  <w:abstractNum w:abstractNumId="5" w15:restartNumberingAfterBreak="0">
-    <w:nsid w:val="53D66E76"/>
+  <w:abstractNum w:abstractNumId="6" w15:restartNumberingAfterBreak="0">
+    <w:nsid w:val="42916B67"/>
     <w:multiLevelType w:val="multilevel"/>
-    <w:tmpl w:val="035892E4"/>
+    <w:tmpl w:val="421E09E8"/>
     <w:lvl w:ilvl="0">
       <w:start w:val="1"/>
       <w:numFmt w:val="bullet"/>
@@ -6017,123 +7029,10 @@
       </w:rPr>
     </w:lvl>
   </w:abstractNum>
-  <w:abstractNum w:abstractNumId="6" w15:restartNumberingAfterBreak="0">
-    <w:nsid w:val="55BA02F4"/>
+  <w:abstractNum w:abstractNumId="7" w15:restartNumberingAfterBreak="0">
+    <w:nsid w:val="4FDB4233"/>
     <w:multiLevelType w:val="multilevel"/>
-    <w:tmpl w:val="0F769426"/>
-    <w:lvl w:ilvl="0">
-      <w:start w:val="1"/>
-      <w:numFmt w:val="decimal"/>
-      <w:lvlText w:val="%1."/>
-      <w:lvlJc w:val="left"/>
-      <w:pPr>
-        <w:tabs>
-          <w:tab w:val="num" w:pos="720"/>
-        </w:tabs>
-        <w:ind w:left="720" w:hanging="360"/>
-      </w:pPr>
-    </w:lvl>
-    <w:lvl w:ilvl="1" w:tentative="1">
-      <w:start w:val="1"/>
-      <w:numFmt w:val="decimal"/>
-      <w:lvlText w:val="%2."/>
-      <w:lvlJc w:val="left"/>
-      <w:pPr>
-        <w:tabs>
-          <w:tab w:val="num" w:pos="1440"/>
-        </w:tabs>
-        <w:ind w:left="1440" w:hanging="360"/>
-      </w:pPr>
-    </w:lvl>
-    <w:lvl w:ilvl="2" w:tentative="1">
-      <w:start w:val="1"/>
-      <w:numFmt w:val="decimal"/>
-      <w:lvlText w:val="%3."/>
-      <w:lvlJc w:val="left"/>
-      <w:pPr>
-        <w:tabs>
-          <w:tab w:val="num" w:pos="2160"/>
-        </w:tabs>
-        <w:ind w:left="2160" w:hanging="360"/>
-      </w:pPr>
-    </w:lvl>
-    <w:lvl w:ilvl="3" w:tentative="1">
-      <w:start w:val="1"/>
-      <w:numFmt w:val="decimal"/>
-      <w:lvlText w:val="%4."/>
-      <w:lvlJc w:val="left"/>
-      <w:pPr>
-        <w:tabs>
-          <w:tab w:val="num" w:pos="2880"/>
-        </w:tabs>
-        <w:ind w:left="2880" w:hanging="360"/>
-      </w:pPr>
-    </w:lvl>
-    <w:lvl w:ilvl="4" w:tentative="1">
-      <w:start w:val="1"/>
-      <w:numFmt w:val="decimal"/>
-      <w:lvlText w:val="%5."/>
-      <w:lvlJc w:val="left"/>
-      <w:pPr>
-        <w:tabs>
-          <w:tab w:val="num" w:pos="3600"/>
-        </w:tabs>
-        <w:ind w:left="3600" w:hanging="360"/>
-      </w:pPr>
-    </w:lvl>
-    <w:lvl w:ilvl="5" w:tentative="1">
-      <w:start w:val="1"/>
-      <w:numFmt w:val="decimal"/>
-      <w:lvlText w:val="%6."/>
-      <w:lvlJc w:val="left"/>
-      <w:pPr>
-        <w:tabs>
-          <w:tab w:val="num" w:pos="4320"/>
-        </w:tabs>
-        <w:ind w:left="4320" w:hanging="360"/>
-      </w:pPr>
-    </w:lvl>
-    <w:lvl w:ilvl="6" w:tentative="1">
-      <w:start w:val="1"/>
-      <w:numFmt w:val="decimal"/>
-      <w:lvlText w:val="%7."/>
-      <w:lvlJc w:val="left"/>
-      <w:pPr>
-        <w:tabs>
-          <w:tab w:val="num" w:pos="5040"/>
-        </w:tabs>
-        <w:ind w:left="5040" w:hanging="360"/>
-      </w:pPr>
-    </w:lvl>
-    <w:lvl w:ilvl="7" w:tentative="1">
-      <w:start w:val="1"/>
-      <w:numFmt w:val="decimal"/>
-      <w:lvlText w:val="%8."/>
-      <w:lvlJc w:val="left"/>
-      <w:pPr>
-        <w:tabs>
-          <w:tab w:val="num" w:pos="5760"/>
-        </w:tabs>
-        <w:ind w:left="5760" w:hanging="360"/>
-      </w:pPr>
-    </w:lvl>
-    <w:lvl w:ilvl="8" w:tentative="1">
-      <w:start w:val="1"/>
-      <w:numFmt w:val="decimal"/>
-      <w:lvlText w:val="%9."/>
-      <w:lvlJc w:val="left"/>
-      <w:pPr>
-        <w:tabs>
-          <w:tab w:val="num" w:pos="6480"/>
-        </w:tabs>
-        <w:ind w:left="6480" w:hanging="360"/>
-      </w:pPr>
-    </w:lvl>
-  </w:abstractNum>
-  <w:abstractNum w:abstractNumId="7" w15:restartNumberingAfterBreak="0">
-    <w:nsid w:val="6F3754A5"/>
-    <w:multiLevelType w:val="multilevel"/>
-    <w:tmpl w:val="F3F24D74"/>
+    <w:tmpl w:val="CBC60ECC"/>
     <w:lvl w:ilvl="0">
       <w:start w:val="1"/>
       <w:numFmt w:val="bullet"/>
@@ -6280,9 +7179,9 @@
     </w:lvl>
   </w:abstractNum>
   <w:abstractNum w:abstractNumId="8" w15:restartNumberingAfterBreak="0">
-    <w:nsid w:val="73A01E21"/>
+    <w:nsid w:val="57C43436"/>
     <w:multiLevelType w:val="multilevel"/>
-    <w:tmpl w:val="19C85690"/>
+    <w:tmpl w:val="6DFAB100"/>
     <w:lvl w:ilvl="0">
       <w:start w:val="1"/>
       <w:numFmt w:val="bullet"/>
@@ -6428,32 +7327,32 @@
       </w:rPr>
     </w:lvl>
   </w:abstractNum>
-  <w:num w:numId="1" w16cid:durableId="138155982">
+  <w:num w:numId="1" w16cid:durableId="1429740597">
+    <w:abstractNumId w:val="0"/>
+  </w:num>
+  <w:num w:numId="2" w16cid:durableId="341932920">
+    <w:abstractNumId w:val="3"/>
+  </w:num>
+  <w:num w:numId="3" w16cid:durableId="24869574">
+    <w:abstractNumId w:val="1"/>
+  </w:num>
+  <w:num w:numId="4" w16cid:durableId="1546216079">
+    <w:abstractNumId w:val="8"/>
+  </w:num>
+  <w:num w:numId="5" w16cid:durableId="1960799395">
+    <w:abstractNumId w:val="5"/>
+  </w:num>
+  <w:num w:numId="6" w16cid:durableId="726997438">
     <w:abstractNumId w:val="6"/>
   </w:num>
-  <w:num w:numId="2" w16cid:durableId="1598246685">
+  <w:num w:numId="7" w16cid:durableId="2059469704">
+    <w:abstractNumId w:val="7"/>
+  </w:num>
+  <w:num w:numId="8" w16cid:durableId="898906666">
     <w:abstractNumId w:val="4"/>
   </w:num>
-  <w:num w:numId="3" w16cid:durableId="993148947">
-    <w:abstractNumId w:val="0"/>
-  </w:num>
-  <w:num w:numId="4" w16cid:durableId="1584491546">
-    <w:abstractNumId w:val="5"/>
-  </w:num>
-  <w:num w:numId="5" w16cid:durableId="426314595">
-    <w:abstractNumId w:val="8"/>
-  </w:num>
-  <w:num w:numId="6" w16cid:durableId="15892405">
-    <w:abstractNumId w:val="3"/>
-  </w:num>
-  <w:num w:numId="7" w16cid:durableId="1205293874">
+  <w:num w:numId="9" w16cid:durableId="1681659904">
     <w:abstractNumId w:val="2"/>
-  </w:num>
-  <w:num w:numId="8" w16cid:durableId="1781562857">
-    <w:abstractNumId w:val="7"/>
-  </w:num>
-  <w:num w:numId="9" w16cid:durableId="1230338621">
-    <w:abstractNumId w:val="1"/>
   </w:num>
 </w:numbering>
 </file>

</xml_diff>